<commit_message>
docs: rename prod URL car-bnb-eta -> drivexp-eta
Vercel project renamed from `car-bnb` to `drivexp` and a new canonical
URL `drivexp-eta.vercel.app` added alongside the existing alias. Brings
the URL into line with the "DriveXP" branding the UI already uses.

- HANDOFF.md, BACKLOG.md, docs/claude-context/* — URL refs updated
- scripts/generate-{digest,tester-guide}.py — embedded URLs updated and
  the .docx outputs regenerated
- BACKLOG decisions table — new row capturing the rename, the kept-as-
  alias rationale, and the unchanged GitHub repo / codebase brand

Old `car-bnb-eta.vercel.app` is retained on Vercel as an alias during
the transition. GitHub repo (`internz2026-sys/CarBNB`) is unchanged.

Co-Authored-By: Claude Opus 4.7 (1M context) <noreply@anthropic.com>
</commit_message>
<xml_diff>
--- a/CarBNB-Tester-Handoff-Guide.docx
+++ b/CarBNB-Tester-Handoff-Guide.docx
@@ -131,7 +131,7 @@
           <w:b/>
           <w:sz w:val="22"/>
         </w:rPr>
-        <w:t>https://car-bnb-eta.vercel.app</w:t>
+        <w:t>https://drivexp-eta.vercel.app</w:t>
       </w:r>
       <w:r>
         <w:rPr>
@@ -289,7 +289,7 @@
           <w:b/>
           <w:sz w:val="22"/>
         </w:rPr>
-        <w:t>https://car-bnb-eta.vercel.app/login</w:t>
+        <w:t>https://drivexp-eta.vercel.app/login</w:t>
       </w:r>
       <w:r>
         <w:rPr>

</xml_diff>